<commit_message>
update(bm): BK08,07,06,06,04,03,02,01, PHULUC I,II
</commit_message>
<xml_diff>
--- a/QTQLĐT&HTQT03/Phụ lục I.docx
+++ b/QTQLĐT&HTQT03/Phụ lục I.docx
@@ -87,7 +87,44 @@
           <w:szCs w:val="26"/>
           <w:lang w:val="vi-VN"/>
         </w:rPr>
-        <w:t>Tên khóa đào tạo: “......................................”</w:t>
+        <w:t>Tên khóa đào tạo: “</w:t>
+      </w:r>
+      <w:r>
+        <w:rPr>
+          <w:rFonts w:ascii="Times New Roman" w:hAnsi="Times New Roman"/>
+          <w:color w:val="000000" w:themeColor="text1"/>
+          <w:sz w:val="26"/>
+          <w:szCs w:val="26"/>
+        </w:rPr>
+        <w:t>[[</w:t>
+      </w:r>
+      <w:r>
+        <w:rPr>
+          <w:rFonts w:ascii="Times New Roman" w:hAnsi="Times New Roman"/>
+          <w:color w:val="000000" w:themeColor="text1"/>
+          <w:sz w:val="26"/>
+          <w:szCs w:val="26"/>
+        </w:rPr>
+        <w:t>TenKhoaHoc</w:t>
+      </w:r>
+      <w:r>
+        <w:rPr>
+          <w:rFonts w:ascii="Times New Roman" w:hAnsi="Times New Roman"/>
+          <w:color w:val="000000" w:themeColor="text1"/>
+          <w:sz w:val="26"/>
+          <w:szCs w:val="26"/>
+        </w:rPr>
+        <w:t>]]</w:t>
+      </w:r>
+      <w:r>
+        <w:rPr>
+          <w:rFonts w:ascii="Times New Roman" w:hAnsi="Times New Roman"/>
+          <w:color w:val="000000" w:themeColor="text1"/>
+          <w:sz w:val="26"/>
+          <w:szCs w:val="26"/>
+          <w:lang w:val="vi-VN"/>
+        </w:rPr>
+        <w:t>”</w:t>
       </w:r>
     </w:p>
     <w:p>
@@ -100,18 +137,63 @@
           <w:color w:val="000000" w:themeColor="text1"/>
           <w:sz w:val="26"/>
           <w:szCs w:val="26"/>
-          <w:lang w:val="vi-VN"/>
-        </w:rPr>
-      </w:pPr>
-      <w:r>
-        <w:rPr>
-          <w:rFonts w:ascii="Times New Roman" w:hAnsi="Times New Roman"/>
-          <w:color w:val="000000" w:themeColor="text1"/>
-          <w:sz w:val="26"/>
-          <w:szCs w:val="26"/>
-          <w:lang w:val="vi-VN"/>
-        </w:rPr>
-        <w:t>Trình độ: Cơ bản/Nâng cao, Mã số: ................</w:t>
+        </w:rPr>
+      </w:pPr>
+      <w:r>
+        <w:rPr>
+          <w:rFonts w:ascii="Times New Roman" w:hAnsi="Times New Roman"/>
+          <w:color w:val="000000" w:themeColor="text1"/>
+          <w:sz w:val="26"/>
+          <w:szCs w:val="26"/>
+          <w:lang w:val="vi-VN"/>
+        </w:rPr>
+        <w:t xml:space="preserve">Trình độ: </w:t>
+      </w:r>
+      <w:r>
+        <w:rPr>
+          <w:rFonts w:ascii="Times New Roman" w:hAnsi="Times New Roman"/>
+          <w:color w:val="000000" w:themeColor="text1"/>
+          <w:sz w:val="26"/>
+          <w:szCs w:val="26"/>
+        </w:rPr>
+        <w:t>[[</w:t>
+      </w:r>
+      <w:r>
+        <w:rPr>
+          <w:rFonts w:ascii="Times New Roman" w:hAnsi="Times New Roman"/>
+          <w:color w:val="000000" w:themeColor="text1"/>
+          <w:sz w:val="26"/>
+          <w:szCs w:val="26"/>
+        </w:rPr>
+        <w:t>TrinhDoDaoTao</w:t>
+      </w:r>
+      <w:r>
+        <w:rPr>
+          <w:rFonts w:ascii="Times New Roman" w:hAnsi="Times New Roman"/>
+          <w:color w:val="000000" w:themeColor="text1"/>
+          <w:sz w:val="26"/>
+          <w:szCs w:val="26"/>
+        </w:rPr>
+        <w:t>]]</w:t>
+      </w:r>
+      <w:r>
+        <w:rPr>
+          <w:rFonts w:ascii="Times New Roman" w:hAnsi="Times New Roman"/>
+          <w:color w:val="000000" w:themeColor="text1"/>
+          <w:sz w:val="26"/>
+          <w:szCs w:val="26"/>
+          <w:lang w:val="vi-VN"/>
+        </w:rPr>
+        <w:t xml:space="preserve">, Mã số: </w:t>
+      </w:r>
+      <w:r>
+        <w:rPr>
+          <w:rFonts w:ascii="Times New Roman" w:hAnsi="Times New Roman"/>
+          <w:color w:val="000000" w:themeColor="text1"/>
+          <w:sz w:val="26"/>
+          <w:szCs w:val="26"/>
+        </w:rPr>
+        <w:t>[[MaSo]]</w:t>
       </w:r>
     </w:p>
     <w:p>
@@ -135,7 +217,81 @@
           <w:szCs w:val="26"/>
           <w:lang w:val="vi-VN"/>
         </w:rPr>
-        <w:t xml:space="preserve">Từ ngày (dd/mm/yyyy) đến ngày (dd/mm/yyyy) </w:t>
+        <w:t>Từ ngày</w:t>
+      </w:r>
+      <w:r>
+        <w:rPr>
+          <w:rFonts w:ascii="Times New Roman" w:hAnsi="Times New Roman"/>
+          <w:color w:val="000000" w:themeColor="text1"/>
+          <w:sz w:val="26"/>
+          <w:szCs w:val="26"/>
+        </w:rPr>
+        <w:t xml:space="preserve"> [[</w:t>
+      </w:r>
+      <w:r>
+        <w:rPr>
+          <w:rFonts w:ascii="Times New Roman" w:hAnsi="Times New Roman"/>
+          <w:color w:val="000000" w:themeColor="text1"/>
+          <w:sz w:val="26"/>
+          <w:szCs w:val="26"/>
+        </w:rPr>
+        <w:t>NgayKhaiGiang</w:t>
+      </w:r>
+      <w:r>
+        <w:rPr>
+          <w:rFonts w:ascii="Times New Roman" w:hAnsi="Times New Roman"/>
+          <w:color w:val="000000" w:themeColor="text1"/>
+          <w:sz w:val="26"/>
+          <w:szCs w:val="26"/>
+        </w:rPr>
+        <w:t>]]</w:t>
+      </w:r>
+      <w:r>
+        <w:rPr>
+          <w:rFonts w:ascii="Times New Roman" w:hAnsi="Times New Roman"/>
+          <w:color w:val="000000" w:themeColor="text1"/>
+          <w:sz w:val="26"/>
+          <w:szCs w:val="26"/>
+          <w:lang w:val="vi-VN"/>
+        </w:rPr>
+        <w:t xml:space="preserve"> đến ngày </w:t>
+      </w:r>
+      <w:r>
+        <w:rPr>
+          <w:rFonts w:ascii="Times New Roman" w:hAnsi="Times New Roman"/>
+          <w:color w:val="000000" w:themeColor="text1"/>
+          <w:sz w:val="26"/>
+          <w:szCs w:val="26"/>
+        </w:rPr>
+        <w:t>[[</w:t>
+      </w:r>
+      <w:r>
+        <w:rPr>
+          <w:rFonts w:ascii="Times New Roman" w:hAnsi="Times New Roman"/>
+          <w:color w:val="000000" w:themeColor="text1"/>
+          <w:sz w:val="26"/>
+          <w:szCs w:val="26"/>
+        </w:rPr>
+        <w:t>NgayKetThuc</w:t>
+      </w:r>
+      <w:r>
+        <w:rPr>
+          <w:rFonts w:ascii="Times New Roman" w:hAnsi="Times New Roman"/>
+          <w:color w:val="000000" w:themeColor="text1"/>
+          <w:sz w:val="26"/>
+          <w:szCs w:val="26"/>
+        </w:rPr>
+        <w:t>]]</w:t>
+      </w:r>
+      <w:r>
+        <w:rPr>
+          <w:rFonts w:ascii="Times New Roman" w:hAnsi="Times New Roman"/>
+          <w:color w:val="000000" w:themeColor="text1"/>
+          <w:sz w:val="26"/>
+          <w:szCs w:val="26"/>
+          <w:lang w:val="vi-VN"/>
+        </w:rPr>
+        <w:t xml:space="preserve"> </w:t>
       </w:r>
     </w:p>
     <w:p>
@@ -148,7 +304,6 @@
           <w:color w:val="000000" w:themeColor="text1"/>
           <w:sz w:val="26"/>
           <w:szCs w:val="26"/>
-          <w:lang w:val="vi-VN"/>
         </w:rPr>
       </w:pPr>
       <w:r>
@@ -160,7 +315,58 @@
           <w:szCs w:val="26"/>
           <w:lang w:val="vi-VN"/>
         </w:rPr>
-        <w:t>(Kèm theo Quyết định số               /QĐ-PSTW ngày          tháng         năm 2024</w:t>
+        <w:t xml:space="preserve">(Kèm theo Quyết định số </w:t>
+      </w:r>
+      <w:r>
+        <w:rPr>
+          <w:rFonts w:ascii="Times New Roman" w:hAnsi="Times New Roman"/>
+          <w:i/>
+          <w:color w:val="000000" w:themeColor="text1"/>
+          <w:sz w:val="26"/>
+          <w:szCs w:val="26"/>
+        </w:rPr>
+        <w:t>[[So]]</w:t>
+      </w:r>
+      <w:r>
+        <w:rPr>
+          <w:rFonts w:ascii="Times New Roman" w:hAnsi="Times New Roman"/>
+          <w:i/>
+          <w:color w:val="000000" w:themeColor="text1"/>
+          <w:sz w:val="26"/>
+          <w:szCs w:val="26"/>
+          <w:lang w:val="vi-VN"/>
+        </w:rPr>
+        <w:t xml:space="preserve">/QĐ-PSTW </w:t>
+      </w:r>
+      <w:r>
+        <w:rPr>
+          <w:rFonts w:ascii="Times New Roman" w:hAnsi="Times New Roman"/>
+          <w:i/>
+          <w:color w:val="000000" w:themeColor="text1"/>
+          <w:sz w:val="26"/>
+          <w:szCs w:val="26"/>
+        </w:rPr>
+        <w:t>[[</w:t>
+      </w:r>
+      <w:r>
+        <w:rPr>
+          <w:rFonts w:ascii="Times New Roman" w:hAnsi="Times New Roman"/>
+          <w:i/>
+          <w:color w:val="000000" w:themeColor="text1"/>
+          <w:sz w:val="26"/>
+          <w:szCs w:val="26"/>
+        </w:rPr>
+        <w:t>NgayThangNamHienTaiDayDu</w:t>
+      </w:r>
+      <w:r>
+        <w:rPr>
+          <w:rFonts w:ascii="Times New Roman" w:hAnsi="Times New Roman"/>
+          <w:i/>
+          <w:color w:val="000000" w:themeColor="text1"/>
+          <w:sz w:val="26"/>
+          <w:szCs w:val="26"/>
+        </w:rPr>
+        <w:t>]]</w:t>
       </w:r>
     </w:p>
     <w:p>
@@ -266,7 +472,6 @@
           <w:color w:val="000000" w:themeColor="text1"/>
           <w:sz w:val="26"/>
           <w:szCs w:val="26"/>
-          <w:lang w:val="vi-VN"/>
         </w:rPr>
       </w:pPr>
       <w:r>
@@ -279,7 +484,40 @@
           <w:szCs w:val="26"/>
           <w:lang w:val="vi-VN"/>
         </w:rPr>
-        <w:t>Địa điểm học: ……………………………</w:t>
+        <w:t xml:space="preserve">Địa điểm học: </w:t>
+      </w:r>
+      <w:r>
+        <w:rPr>
+          <w:rFonts w:ascii="Times New Roman" w:hAnsi="Times New Roman"/>
+          <w:b/>
+          <w:bCs/>
+          <w:color w:val="000000" w:themeColor="text1"/>
+          <w:sz w:val="26"/>
+          <w:szCs w:val="26"/>
+        </w:rPr>
+        <w:t>[[</w:t>
+      </w:r>
+      <w:r>
+        <w:rPr>
+          <w:rFonts w:ascii="Times New Roman" w:hAnsi="Times New Roman"/>
+          <w:b/>
+          <w:bCs/>
+          <w:color w:val="000000" w:themeColor="text1"/>
+          <w:sz w:val="26"/>
+          <w:szCs w:val="26"/>
+        </w:rPr>
+        <w:t>DiaDiemHoc</w:t>
+      </w:r>
+      <w:r>
+        <w:rPr>
+          <w:rFonts w:ascii="Times New Roman" w:hAnsi="Times New Roman"/>
+          <w:b/>
+          <w:bCs/>
+          <w:color w:val="000000" w:themeColor="text1"/>
+          <w:sz w:val="26"/>
+          <w:szCs w:val="26"/>
+        </w:rPr>
+        <w:t>]]</w:t>
       </w:r>
     </w:p>
     <w:p>

</xml_diff>